<commit_message>
Figure/table revision: age validation, Figures 2-4, Tables 1-2, validation gates
- Figure 5 age validation (scripts 46-47): age x profile support audit,
  age-interaction GAM diagnostics, age-group standardised risks, robustness.
- Revised manuscript figures (48-58): Figure 2 profile RR redesign; Figure 3
  age-specific absolute risks incl. validated hospitalisation age model (H2)
  and standalone panels/legend; Figure 4 count-vs-profile model comparison
  and final within-count risk-difference figure with title/legend docx.
- Tables (59-60): Table 1 with cohort selection/outcome completeness;
  reconciled joint-profile Main Table 2 and individual-condition supplement;
  reconciliation reports (no numerical discrepancies; stale N in old note fixed).
- Validation gates 3.1-3.4 outputs and scripts 11, 23-45 from earlier sessions.
- .gitignore: exclude individual-level data in 01_Data subfolders and large
  per-person/per-draw caches.
</commit_message>
<xml_diff>
--- a/CHIK_MORBID/03_Output/tables/table1_analytic_cohorts.docx
+++ b/CHIK_MORBID/03_Output/tables/table1_analytic_cohorts.docx
@@ -446,7 +446,7 @@
                 <w:szCs w:val="17"/>
                 <w:color w:val="263238"/>
               </w:rPr>
-              <w:t xml:space="preserve">1,074,796</w:t>
+              <w:t xml:space="preserve">983,947</w:t>
             </w:r>
           </w:p>
         </w:tc>
@@ -784,7 +784,7 @@
                 <w:szCs w:val="17"/>
                 <w:color w:val="263238"/>
               </w:rPr>
-              <w:t xml:space="preserve">655,585 (61.0%)</w:t>
+              <w:t xml:space="preserve">600,128 (61.0%)</w:t>
             </w:r>
           </w:p>
         </w:tc>
@@ -953,7 +953,7 @@
                 <w:szCs w:val="17"/>
                 <w:color w:val="263238"/>
               </w:rPr>
-              <w:t xml:space="preserve">419,211 (39.0%)</w:t>
+              <w:t xml:space="preserve">383,819 (39.0%)</w:t>
             </w:r>
           </w:p>
         </w:tc>
@@ -1522,7 +1522,7 @@
                 <w:szCs w:val="17"/>
                 <w:color w:val="263238"/>
               </w:rPr>
-              <w:t xml:space="preserve">49,767 (4.6%)</w:t>
+              <w:t xml:space="preserve">45,529 (4.6%)</w:t>
             </w:r>
           </w:p>
         </w:tc>
@@ -1691,7 +1691,7 @@
                 <w:szCs w:val="17"/>
                 <w:color w:val="263238"/>
               </w:rPr>
-              <w:t xml:space="preserve">120,904 (11.2%)</w:t>
+              <w:t xml:space="preserve">110,350 (11.2%)</w:t>
             </w:r>
           </w:p>
         </w:tc>
@@ -1860,7 +1860,7 @@
                 <w:szCs w:val="17"/>
                 <w:color w:val="263238"/>
               </w:rPr>
-              <w:t xml:space="preserve">4,899 (0.5%)</w:t>
+              <w:t xml:space="preserve">4,412 (0.4%)</w:t>
             </w:r>
           </w:p>
         </w:tc>
@@ -2091,7 +2091,7 @@
                 <w:szCs w:val="17"/>
                 <w:color w:val="263238"/>
               </w:rPr>
-              <w:t xml:space="preserve">935,038 (87.0%)</w:t>
+              <w:t xml:space="preserve">856,342 (87.0%)</w:t>
             </w:r>
           </w:p>
         </w:tc>
@@ -2260,7 +2260,7 @@
                 <w:szCs w:val="17"/>
                 <w:color w:val="263238"/>
               </w:rPr>
-              <w:t xml:space="preserve">16,688 (1.6%)</w:t>
+              <w:t xml:space="preserve">15,302 (1.6%)</w:t>
             </w:r>
           </w:p>
         </w:tc>
@@ -2429,7 +2429,7 @@
                 <w:szCs w:val="17"/>
                 <w:color w:val="263238"/>
               </w:rPr>
-              <w:t xml:space="preserve">87,125 (8.1%)</w:t>
+              <w:t xml:space="preserve">79,512 (8.1%)</w:t>
             </w:r>
           </w:p>
         </w:tc>
@@ -2598,7 +2598,7 @@
                 <w:szCs w:val="17"/>
                 <w:color w:val="263238"/>
               </w:rPr>
-              <w:t xml:space="preserve">1,826 (0.2%)</w:t>
+              <w:t xml:space="preserve">1,640 (0.2%)</w:t>
             </w:r>
           </w:p>
         </w:tc>
@@ -2767,7 +2767,7 @@
                 <w:szCs w:val="17"/>
                 <w:color w:val="263238"/>
               </w:rPr>
-              <w:t xml:space="preserve">31,046 (2.9%)</w:t>
+              <w:t xml:space="preserve">28,379 (2.9%)</w:t>
             </w:r>
           </w:p>
         </w:tc>
@@ -2936,7 +2936,7 @@
                 <w:szCs w:val="17"/>
                 <w:color w:val="263238"/>
               </w:rPr>
-              <w:t xml:space="preserve">340 (0.0%)</w:t>
+              <w:t xml:space="preserve">313 (0.0%)</w:t>
             </w:r>
           </w:p>
         </w:tc>
@@ -3105,7 +3105,7 @@
                 <w:szCs w:val="17"/>
                 <w:color w:val="263238"/>
               </w:rPr>
-              <w:t xml:space="preserve">1,040 (0.1%)</w:t>
+              <w:t xml:space="preserve">924 (0.1%)</w:t>
             </w:r>
           </w:p>
         </w:tc>
@@ -3274,7 +3274,7 @@
                 <w:szCs w:val="17"/>
                 <w:color w:val="263238"/>
               </w:rPr>
-              <w:t xml:space="preserve">1,693 (0.2%)</w:t>
+              <w:t xml:space="preserve">1,535 (0.2%)</w:t>
             </w:r>
           </w:p>
         </w:tc>

</xml_diff>